<commit_message>
docs(intermodular): enfocar propuesta de Tarea 0 e Hito 1 en venta de servicio para tiendas locales
</commit_message>
<xml_diff>
--- a/Proyecto intermodular/UD1/Tarea0-2DAM/Tarea0_LeadCraft_Kevin.docx
+++ b/Proyecto intermodular/UD1/Tarea0-2DAM/Tarea0_LeadCraft_Kevin.docx
@@ -49,7 +49,7 @@
           <w:color w:val="0038FF"/>
           <w:sz w:val="26"/>
         </w:rPr>
-        <w:t>Plataforma Inteligente de Prospección Geográfica, Auditoría Digital y Generación Asistida de Soluciones Web para Pequeños Negocios</w:t>
+        <w:t>Servicio Integral de Gestión y Presencia Online para Ayudar al Pequeño Comercio Local a Llevar su Negocio en Internet</w:t>
       </w:r>
     </w:p>
     <w:p>
@@ -192,7 +192,7 @@
             <w:color w:val="0A192F"/>
             <w:u w:val="single"/>
           </w:rPr>
-          <w:t>2. Propuesta de Solución Digital: LeadCraft AI</w:t>
+          <w:t>2. Propuesta de Solución Digital: El Servicio LeadCraft AI</w:t>
         </w:r>
       </w:hyperlink>
       <w:r>
@@ -378,7 +378,7 @@
           <w:color w:val="28323C"/>
           <w:sz w:val="24"/>
         </w:rPr>
-        <w:t>En nuestras ciudades y barrios existen miles de pequeños comercios (peluquerías, talleres mecánicos, clínicas de fisioterapia o pequeños restaurantes) que tienen una presencia digital prácticamente inexistente o muy descuidada. La mayoría aparecen registrados en Google Maps pero carecen de página web propia, no disponen de un sistema para reservar citas online y dependen de llamadas telefónicas mientras atienden a sus clientes. Esto les hace perder ventas a diario frente a grandes franquicias. Al mismo tiempo, los profesionales y pequeñas agencias que se dedican a crear páginas web invierten semanas buscando clientes 'puerta a puerta', auditando sus carencias a mano y presentando presupuestos en frío que rara vez se aceptan porque el comerciante no visualiza el resultado final.</w:t>
+        <w:t>En nuestras ciudades y barrios existen miles de pequeños comercios (peluquerías, talleres mecánicos, clínicas dentales o de fisioterapia y tiendas locales) que se ven completamente sobrepasados para llevar su presencia en Internet. La mayoría tienen una ficha en Google Maps, pero carecen de página web propia, no disponen de un sistema para reservar citas online y dependen de atender llamadas telefónicas mientras despachan a clientes en el mostrador. Esto les hace perder ventas a diario frente a grandes franquicias. Contratar agencias tradicionales resulta inasumible (cobran más de 1.000€ iniciales más costosas cuotas mensuales), y los dueños no disponen de tiempo ni conocimientos técnicos para gestionarlo por su cuenta. Al mismo tiempo, los profesionales y jóvenes desarrolladores que ofrecen servicios digitales invierten semanas contactando 'a puerta fría' sin una propuesta visual construida que convenza al comerciante.</w:t>
       </w:r>
     </w:p>
     <w:p>
@@ -401,7 +401,7 @@
           <w:color w:val="28323C"/>
           <w:sz w:val="24"/>
         </w:rPr>
-        <w:t>Afecta principalmente a dos perfiles: por un lado, a los dueños de pequeños negocios y pymes locales, que no tienen tiempo, presupuesto ni conocimientos técnicos para contratar agencias de marketing tradicionales (cuyos costes suelen superar los 1.000€). Por otro lado, a jóvenes desarrolladores, diseñadores freelance y consultores comerciales que buscan clientes locales pero carecen de una herramienta rápida para identificar oportunidades de negocio en su zona y mostrar propuestas ya construidas.</w:t>
+        <w:t>Afecta principalmente a los dueños de pequeños comercios y autónomos locales, que no pueden atender el mostrador físico y al mismo tiempo gestionar citas, mensajes y catálogos en la red. También perjudica a los vecinos y clientes locales, que no pueden reservar hora ni informarse fuera del horario comercial. Por último, afecta a jóvenes titulados de DAM y consultores freelance, que necesitan un sistema ágil para empaquetar y vender este servicio de gestión digital a los comercios de su entorno.</w:t>
       </w:r>
     </w:p>
     <w:p>
@@ -424,7 +424,7 @@
           <w:color w:val="28323C"/>
           <w:sz w:val="24"/>
         </w:rPr>
-        <w:t>Mejorar esta situación es fundamental para revitalizar el comercio de barrio. Si un comercial o desarrollador puede detectar en segundos qué le falta a un negocio y presentarse con una web ya maquetada y lista para funcionar, la probabilidad de contratación se multiplica. Este proyecto impacta directamente en el ODS 8 (Trabajo decente y crecimiento económico), al fomentar la competitividad de las microempresas locales, y en el ODS 9 (Industria, innovación e infraestructura), al democratizar el acceso a la tecnología digital para el pequeño comercio.</w:t>
+        <w:t>Resolver esta brecha es indispensable para la viabilidad del comercio tradicional. Venderles un servicio llave en mano y asequible que les gestione su web y reservas online les permite competir en igualdad de condiciones con el comercio electrónico. Este proyecto impacta directamente en el ODS 8 (Trabajo decente y crecimiento económico), al fomentar la productividad de microempresas, y en el ODS 9 (Industria, innovación e infraestructura), al democratizar el acceso a la tecnología y la inteligencia artificial para negocios de proximidad.</w:t>
       </w:r>
     </w:p>
     <w:p>
@@ -440,7 +440,7 @@
           <w:color w:val="0A192F"/>
           <w:sz w:val="28"/>
         </w:rPr>
-        <w:t>2. Propuesta de Solución Digital: LeadCraft AI</w:t>
+        <w:t>2. Propuesta de Solución Digital: El Servicio LeadCraft AI</w:t>
       </w:r>
       <w:bookmarkEnd w:id="3"/>
     </w:p>
@@ -464,7 +464,7 @@
           <w:color w:val="28323C"/>
           <w:sz w:val="24"/>
         </w:rPr>
-        <w:t>LeadCraft AI es una aplicación multiplataforma (escritorio y web) que combina la exploración de mapas de Google con inteligencia artificial generativa. Permite navegar por cualquier barrio o código postal, seleccionar comercios locales y analizar automáticamente qué carencias digitales tienen, generando al instante una landing page moderna con sistema de citas online y contacto por WhatsApp lista para enseñar al cliente.</w:t>
+        <w:t>LeadCraft AI es una plataforma de software diseñada para comercializar un servicio integral de digitalización y gestión online para comercios locales. El núcleo del proyecto no consiste únicamente en crear páginas web estáticas, sino en vender un servicio activo de la aplicación que ayuda al comerciante a llevar su negocio o tienda en Internet de forma continuada: incluye el despliegue de su web profesional generada mediante IA, un gestor interactivo de citas y reservas en tiempo real, catálogo de servicios actualizado, canal directo de pedidos por WhatsApp y un panel sencillo desde el que el comerciante consulta sus reservas diarias sin complicaciones técnicas ni costes desproporcionados.</w:t>
       </w:r>
     </w:p>
     <w:p>
@@ -487,7 +487,7 @@
           <w:color w:val="28323C"/>
           <w:sz w:val="24"/>
         </w:rPr>
-        <w:t>La aplicación permite: 1) Buscar negocios en el mapa filtrando por categoría (ej. barberías en Madrid); 2) Ejecutar una 'Auditoría Digital Express' que comprueba si tienen web, SSL, reservas online o redes sociales; 3) Conectar con un modelo de IA (API de Gemini/OpenAI) para redactar el contenido y personalizar una plantilla web profesional con los datos de Google Maps (fotos, horarios, reseñas); 4) Probar la web generada en un previsualizador en vivo con widget de citas; 5) Exportar el sitio web en código limpio y generar un dossier PDF de propuesta comercial.</w:t>
+        <w:t>La solución permite: 1) Explorar negocios en Google Maps filtrando por sector y zona geográfica; 2) Auditar en 3 segundos sus carencias digitales (si carecen de web, citas online o redes); 3) Generar con una API de IA una web completa y personalizada con la información de Maps (fotos, horarios, carta de servicios); 4) Activar un módulo interactivo de reservas y contacto por WhatsApp para que la tienda atienda clientes 24/7; 5) Facilitar al dueño un panel de control para gestionar citas diarias y precios; y 6) Empaquetar y vender esta solución bajo una suscripción mensual asequible de mantenimiento y soporte.</w:t>
       </w:r>
     </w:p>
     <w:p>
@@ -510,7 +510,7 @@
           <w:color w:val="28323C"/>
           <w:sz w:val="24"/>
         </w:rPr>
-        <w:t>El sistema está dirigido a freelancers, comerciales y agencias de desarrollo web que buscan clientes de proximidad, así como a asociaciones de comerciantes que quieran impulsar la transformación digital de sus negocios locales de forma asequible.</w:t>
+        <w:t>El servicio está dirigido a los comerciantes y autónomos locales (los clientes del servicio, que obtienen una solución lista para gestionar su negocio online sin esfuerzo técnico), sus clientes finales (que reservan citas y consultan productos desde el móvil), y el operador o consultor comercial (estudiante de DAM o desarrollador) que prospecta la zona y administra la implantación del servicio.</w:t>
       </w:r>
     </w:p>
     <w:p>
@@ -615,7 +615,7 @@
                 <w:color w:val="1E293B"/>
                 <w:sz w:val="20"/>
               </w:rPr>
-              <w:t>Búsqueda Geográfica de Negocios</w:t>
+              <w:t>Búsqueda Geográfica y Auditoría</w:t>
             </w:r>
           </w:p>
         </w:tc>
@@ -634,7 +634,7 @@
                 <w:color w:val="1E293B"/>
                 <w:sz w:val="20"/>
               </w:rPr>
-              <w:t>Permite explorar zonas concretas sobre Google Maps y localizar comercios locales clasificados por sector (barberías, clínicas, hostelería).</w:t>
+              <w:t>Localiza comercios sobre Google Maps y analiza en tiempo real sus carencias digitales (ausencia de web, citas online o datos desactualizados).</w:t>
             </w:r>
           </w:p>
         </w:tc>
@@ -656,7 +656,7 @@
                 <w:color w:val="1E293B"/>
                 <w:sz w:val="20"/>
               </w:rPr>
-              <w:t>Motor de Auditoría Digital Express</w:t>
+              <w:t>Generador Web con IA para Negocios</w:t>
             </w:r>
           </w:p>
         </w:tc>
@@ -675,7 +675,7 @@
                 <w:color w:val="1E293B"/>
                 <w:sz w:val="20"/>
               </w:rPr>
-              <w:t>Escanea en tiempo real si el comercio tiene web activa, certificado HTTPS, enlace de reservas, puntuación de reseñas y teléfono de contacto.</w:t>
+              <w:t>A partir de la ficha de Maps, una API de IA redacta textos comerciales, estructura los servicios y maqueta una web moderna y responsive.</w:t>
             </w:r>
           </w:p>
         </w:tc>
@@ -697,7 +697,7 @@
                 <w:color w:val="1E293B"/>
                 <w:sz w:val="20"/>
               </w:rPr>
-              <w:t>Generador Web Asistido por IA</w:t>
+              <w:t>Gestor Integrado de Citas y Reservas</w:t>
             </w:r>
           </w:p>
         </w:tc>
@@ -716,7 +716,7 @@
                 <w:color w:val="1E293B"/>
                 <w:sz w:val="20"/>
               </w:rPr>
-              <w:t>A partir de la ficha de Maps, una API de IA redacta textos comerciales, selecciona servicios y ensambla una landing page moderna y responsive.</w:t>
+              <w:t>Incorpora un calendario interactivo con franjas horarias y confirmación inmediata para que los clientes reserven online 24/7.</w:t>
             </w:r>
           </w:p>
         </w:tc>
@@ -738,7 +738,7 @@
                 <w:color w:val="1E293B"/>
                 <w:sz w:val="20"/>
               </w:rPr>
-              <w:t>Widget Integrado de Citas Online</w:t>
+              <w:t>Canal Directo de Contacto por WhatsApp</w:t>
             </w:r>
           </w:p>
         </w:tc>
@@ -757,7 +757,7 @@
                 <w:color w:val="1E293B"/>
                 <w:sz w:val="20"/>
               </w:rPr>
-              <w:t>Incuba un calendario de citas con franjas horarias y confirmación en la web generada, resolviendo la necesidad de gestión de reservas.</w:t>
+              <w:t>Enlace automatizado que envía las consultas de clientes y solicitudes de servicio directamente al móvil del comerciante.</w:t>
             </w:r>
           </w:p>
         </w:tc>
@@ -779,7 +779,7 @@
                 <w:color w:val="1E293B"/>
                 <w:sz w:val="20"/>
               </w:rPr>
-              <w:t>Previsualizador en Vivo y Edición Rápida</w:t>
+              <w:t>Panel de Control para el Comerciante</w:t>
             </w:r>
           </w:p>
         </w:tc>
@@ -798,7 +798,7 @@
                 <w:color w:val="1E293B"/>
                 <w:sz w:val="20"/>
               </w:rPr>
-              <w:t>Permite ver el resultado en vista móvil y escritorio, retocar precios, horarios o colores antes de generar la propuesta final.</w:t>
+              <w:t>Interfaz sencilla para consultar las reservas diarias, confirmar citas y actualizar precios u horarios desde cualquier dispositivo.</w:t>
             </w:r>
           </w:p>
         </w:tc>
@@ -820,7 +820,7 @@
                 <w:color w:val="1E293B"/>
                 <w:sz w:val="20"/>
               </w:rPr>
-              <w:t>Dossier Comercial y Exportación</w:t>
+              <w:t>Dossier Comercial y Despliegue Cloud</w:t>
             </w:r>
           </w:p>
         </w:tc>
@@ -839,7 +839,7 @@
                 <w:color w:val="1E293B"/>
                 <w:sz w:val="20"/>
               </w:rPr>
-              <w:t>Genera un informe descargable de auditoría en PDF y exporta el código HTML/Tailwind en un archivo ZIP listo para publicar.</w:t>
+              <w:t>Genera informes descargables en PDF para la venta del servicio y permite exportar y publicar la web en servidores en la nube.</w:t>
             </w:r>
           </w:p>
         </w:tc>
@@ -882,7 +882,7 @@
           <w:color w:val="28323C"/>
           <w:sz w:val="24"/>
         </w:rPr>
-        <w:t>Como ampliación futura se prevé integrar un bot conversacional de WhatsApp conectado a la API de IA que atienda dudas y gestione las reservas de los clientes de forma automática 24/7. Además, se incorporará la conexión directa con pasarelas de pago (Stripe) para permitir el cobro de fianzas o citas online y el despliegue automático del sitio web con un solo clic en servidores cloud como Vercel o Netlify con dominio personalizado.</w:t>
+        <w:t>Como ampliación futura se prevé integrar un asistente virtual de WhatsApp impulsado por IA para atender preguntas frecuentes de los clientes y gestionar citas de forma automática las 24 horas del día. Además, se incorporará la pasarela de pagos con Stripe para permitir el cobro de señales de reserva o pedidos online y la sincronización bidireccional automática con la agenda de Google Calendar del negocio.</w:t>
       </w:r>
     </w:p>
     <w:p>
@@ -954,7 +954,7 @@
           <w:color w:val="64748B"/>
           <w:sz w:val="17"/>
         </w:rPr>
-        <w:t>Figura 1: Prototipo de LeadCraft AI mostrando el mapa de prospección y la auditoría digital de un negocio local.</w:t>
+        <w:t>Figura 1: Prototipo de LeadCraft AI mostrando el buscador geográfico de comercios locales y el panel de auditoría para la venta del servicio digital.</w:t>
       </w:r>
     </w:p>
     <w:p>

</xml_diff>